<commit_message>
Lab4 mistakes fixed sry.
</commit_message>
<xml_diff>
--- a/Lab4/Lab4_revised2026.docx
+++ b/Lab4/Lab4_revised2026.docx
@@ -4278,10 +4278,10 @@
         </w:rPr>
         <w:lastRenderedPageBreak/>
         <w:drawing>
-          <wp:inline distT="0" distB="0" distL="0" distR="0" wp14:anchorId="2161761E" wp14:editId="48DDFB80">
-            <wp:extent cx="5943600" cy="3042285"/>
-            <wp:effectExtent l="0" t="0" r="0" b="5715"/>
-            <wp:docPr id="1134251453" name="Picture 1"/>
+          <wp:inline distT="0" distB="0" distL="0" distR="0" wp14:anchorId="18437C1F" wp14:editId="526457CB">
+            <wp:extent cx="5943600" cy="3041015"/>
+            <wp:effectExtent l="0" t="0" r="0" b="6985"/>
+            <wp:docPr id="1721178911" name="Picture 1"/>
             <wp:cNvGraphicFramePr>
               <a:graphicFrameLocks xmlns:a="http://schemas.openxmlformats.org/drawingml/2006/main" noChangeAspect="1"/>
             </wp:cNvGraphicFramePr>
@@ -4310,7 +4310,7 @@
                   <pic:spPr bwMode="auto">
                     <a:xfrm>
                       <a:off x="0" y="0"/>
-                      <a:ext cx="5943600" cy="3042285"/>
+                      <a:ext cx="5943600" cy="3041015"/>
                     </a:xfrm>
                     <a:prstGeom prst="rect">
                       <a:avLst/>

</xml_diff>